<commit_message>
docs: add rev1 req
</commit_message>
<xml_diff>
--- a/reports/Student #3/C2/03 - Requirements - Student #3 - REV1.docx
+++ b/reports/Student #3/C2/03 - Requirements - Student #3 - REV1.docx
@@ -385,6 +385,7 @@
             <w:sdt>
               <w:sdtPr>
                 <w:rPr>
+                  <w:u w:val="single"/>
                   <w:lang w:val="pt-PT"/>
                 </w:rPr>
                 <w:tag w:val="Student2"/>
@@ -398,6 +399,7 @@
                 <w:r>
                   <w:rPr>
                     <w:rFonts w:asciiTheme="majorHAnsi" w:hAnsiTheme="majorHAnsi" w:cstheme="majorHAnsi"/>
+                    <w:u w:val="single"/>
                     <w:lang w:val="pt-PT"/>
                   </w:rPr>
                   <w:t xml:space="preserve"> Sánchez Márquez, Julia  </w:t>
@@ -915,31 +917,7 @@
           <w:highlight w:val="yellow"/>
           <w:lang w:val="es-ES"/>
         </w:rPr>
-        <w:t>CAMBIO: Corregir ese problema haciendo público el proyecto y estruct</w:t>
-      </w:r>
-      <w:r>
-        <w:rPr>
-          <w:rFonts w:asciiTheme="majorHAnsi" w:hAnsiTheme="majorHAnsi" w:cstheme="majorHAnsi"/>
-          <w:highlight w:val="yellow"/>
-          <w:lang w:val="es-ES"/>
-        </w:rPr>
-        <w:t>u</w:t>
-      </w:r>
-      <w:r>
-        <w:rPr>
-          <w:rFonts w:asciiTheme="majorHAnsi" w:hAnsiTheme="majorHAnsi" w:cstheme="majorHAnsi"/>
-          <w:highlight w:val="yellow"/>
-          <w:lang w:val="es-ES"/>
-        </w:rPr>
-        <w:t>rarlo de forma adecuada</w:t>
-      </w:r>
-      <w:r>
-        <w:rPr>
-          <w:rFonts w:asciiTheme="majorHAnsi" w:hAnsiTheme="majorHAnsi" w:cstheme="majorHAnsi"/>
-          <w:highlight w:val="yellow"/>
-          <w:lang w:val="es-ES"/>
-        </w:rPr>
-        <w:t xml:space="preserve"> creando tareas de revisión para controlar la calidad y añadiendo un archivo .txt en la carpeta “Reports &gt; Student 3 &gt; C2” </w:t>
+        <w:t xml:space="preserve">CAMBIO: Corregir ese problema haciendo público el proyecto y estructurarlo de forma adecuada creando tareas de revisión para controlar la calidad y añadiendo un archivo .txt en la carpeta “Reports &gt; Student 3 &gt; C2” </w:t>
       </w:r>
       <w:r>
         <w:rPr>
@@ -1283,14 +1261,7 @@
           <w:highlight w:val="yellow"/>
           <w:lang w:val="es-ES"/>
         </w:rPr>
-        <w:t xml:space="preserve">CAMBIO: </w:t>
-      </w:r>
-      <w:r>
-        <w:rPr>
-          <w:highlight w:val="yellow"/>
-          <w:lang w:val="es-ES"/>
-        </w:rPr>
-        <w:t xml:space="preserve">Tras revisar y analizar detenidamente esta evaluación he llegado a la conclusión de que no hace falta definir los limites pues ya en el application.properties vienen definidos exactamente dichos valores por lo que </w:t>
+        <w:t xml:space="preserve">CAMBIO: Tras revisar y analizar detenidamente esta evaluación he llegado a la conclusión de que no hace falta definir los limites pues ya en el application.properties vienen definidos exactamente dichos valores por lo que </w:t>
       </w:r>
       <w:r>
         <w:rPr>
@@ -1533,14 +1504,7 @@
           <w:highlight w:val="yellow"/>
           <w:lang w:val="es-ES"/>
         </w:rPr>
-        <w:t xml:space="preserve">CAMBIO: </w:t>
-      </w:r>
-      <w:r>
-        <w:rPr>
-          <w:highlight w:val="yellow"/>
-          <w:lang w:val="es-ES"/>
-        </w:rPr>
-        <w:t>Tras analizar el requisito llegué a la conclusión de que con setear dicho valor en la clase de la feature correspondiente es suficiente y esto, aunque no ocasiona ningún problema puede ser redundante, por tanto, he eliminado dichos valores iniciales</w:t>
+        <w:t>CAMBIO: Tras analizar el requisito llegué a la conclusión de que con setear dicho valor en la clase de la feature correspondiente es suficiente y esto, aunque no ocasiona ningún problema puede ser redundante, por tanto, he eliminado dichos valores iniciales</w:t>
       </w:r>
     </w:p>
     <w:p>
@@ -1764,21 +1728,7 @@
           <w:highlight w:val="yellow"/>
           <w:lang w:val="es-ES"/>
         </w:rPr>
-        <w:t xml:space="preserve">CAMBIO: Tras analizar el requisito llegué a la conclusión de que con setear dicho valor en la clase de la feature correspondiente es suficiente y </w:t>
-      </w:r>
-      <w:r>
-        <w:rPr>
-          <w:highlight w:val="yellow"/>
-          <w:lang w:val="es-ES"/>
-        </w:rPr>
-        <w:t>esto,</w:t>
-      </w:r>
-      <w:r>
-        <w:rPr>
-          <w:highlight w:val="yellow"/>
-          <w:lang w:val="es-ES"/>
-        </w:rPr>
-        <w:t xml:space="preserve"> aunque no ocasiona ningún problema puede ser redundante, por tanto, he eliminado dichos valores iniciales</w:t>
+        <w:t>CAMBIO: Tras analizar el requisito llegué a la conclusión de que con setear dicho valor en la clase de la feature correspondiente es suficiente y esto, aunque no ocasiona ningún problema puede ser redundante, por tanto, he eliminado dichos valores iniciales</w:t>
       </w:r>
     </w:p>
     <w:p>
@@ -2340,23 +2290,7 @@
           <w:highlight w:val="yellow"/>
           <w:lang w:val="es-ES"/>
         </w:rPr>
-        <w:t>privilegios</w:t>
-      </w:r>
-      <w:r>
-        <w:rPr>
-          <w:rFonts w:asciiTheme="majorHAnsi" w:hAnsiTheme="majorHAnsi" w:cstheme="majorHAnsi"/>
-          <w:highlight w:val="yellow"/>
-          <w:lang w:val="es-ES"/>
-        </w:rPr>
-        <w:t>.</w:t>
-      </w:r>
-      <w:r>
-        <w:rPr>
-          <w:rFonts w:asciiTheme="majorHAnsi" w:hAnsiTheme="majorHAnsi" w:cstheme="majorHAnsi"/>
-          <w:highlight w:val="yellow"/>
-          <w:lang w:val="es-ES"/>
-        </w:rPr>
-        <w:t xml:space="preserve"> Todos los crew </w:t>
+        <w:t xml:space="preserve">privilegios. Todos los crew </w:t>
       </w:r>
       <w:r>
         <w:rPr>
@@ -2875,15 +2809,7 @@
           <w:highlight w:val="yellow"/>
           <w:lang w:val="es-ES"/>
         </w:rPr>
-        <w:t xml:space="preserve">CAMBIAR: </w:t>
-      </w:r>
-      <w:r>
-        <w:rPr>
-          <w:rFonts w:asciiTheme="majorHAnsi" w:hAnsiTheme="majorHAnsi" w:cstheme="majorHAnsi"/>
-          <w:highlight w:val="yellow"/>
-          <w:lang w:val="es-ES"/>
-        </w:rPr>
-        <w:t>Respecto al comentario recibido, he revisado a fondo la lógica de publicación de ActivityLog y su relación con el estado del FlightAssignment. Un ActivityLog solo puede publicarse cuando el FlightAssignment correspondiente ya ha sido publicado (no está en modo borrador) y su Leg ya ha ocurrido (es decir, la fecha de salida ha pasado).</w:t>
+        <w:t>CAMBIAR: Respecto al comentario recibido, he revisado a fondo la lógica de publicación de ActivityLog y su relación con el estado del FlightAssignment. Un ActivityLog solo puede publicarse cuando el FlightAssignment correspondiente ya ha sido publicado (no está en modo borrador) y su Leg ya ha ocurrido (es decir, la fecha de salida ha pasado).</w:t>
       </w:r>
     </w:p>
     <w:p>
@@ -3023,43 +2949,19 @@
           <w:highlight w:val="yellow"/>
           <w:lang w:val="es-ES"/>
         </w:rPr>
-        <w:t>Para mayor claridad, he añadido un texto explicativo en la interfaz</w:t>
-      </w:r>
-      <w:r>
-        <w:rPr>
-          <w:rFonts w:asciiTheme="majorHAnsi" w:hAnsiTheme="majorHAnsi" w:cstheme="majorHAnsi"/>
-          <w:highlight w:val="yellow"/>
-          <w:lang w:val="es-ES"/>
-        </w:rPr>
-        <w:t xml:space="preserve"> de cada Flight Assignment</w:t>
-      </w:r>
-      <w:r>
-        <w:rPr>
-          <w:rFonts w:asciiTheme="majorHAnsi" w:hAnsiTheme="majorHAnsi" w:cstheme="majorHAnsi"/>
-          <w:highlight w:val="yellow"/>
-          <w:lang w:val="es-ES"/>
-        </w:rPr>
-        <w:t xml:space="preserve"> indicando que para poder visualizar o registrar ActivityLogs, el FlightAssignment debe estar publicado y el Leg debe haber ocurrido. Asimismo, he deshabilitado el botón "Mostrar Activity Logs" si se detecta que no se cumplen esas condiciones, ya que, como se ha explicado, nunca se podría registrar nada en ese contexto</w:t>
-      </w:r>
-      <w:r>
-        <w:rPr>
-          <w:rFonts w:asciiTheme="majorHAnsi" w:hAnsiTheme="majorHAnsi" w:cstheme="majorHAnsi"/>
-          <w:highlight w:val="yellow"/>
-          <w:lang w:val="es-ES"/>
-        </w:rPr>
-        <w:t xml:space="preserve"> y así se ofrece mayor claridad al cliente.</w:t>
+        <w:t>Para mayor claridad, he añadido un texto explicativo en la interfaz de cada Flight Assignment indicando que para poder visualizar o registrar ActivityLogs, el FlightAssignment debe estar publicado y el Leg debe haber ocurrido. Asimismo, he deshabilitado el botón "Mostrar Activity Logs" si se detecta que no se cumplen esas condiciones, ya que, como se ha explicado, nunca se podría registrar nada en ese contexto y así se ofrece mayor claridad al cliente.</w:t>
       </w:r>
     </w:p>
     <w:p>
       <w:pPr>
         <w:pStyle w:val="Ttulo2"/>
         <w:rPr>
-          <w:lang w:val="es-ES"/>
-        </w:rPr>
-      </w:pPr>
-      <w:r>
-        <w:rPr>
-          <w:lang w:val="es-ES"/>
+          <w:lang w:val="en-US"/>
+        </w:rPr>
+      </w:pPr>
+      <w:r>
+        <w:rPr>
+          <w:lang w:val="en-US"/>
         </w:rPr>
         <w:t>Non-functional requirements</w:t>
       </w:r>
@@ -3532,9 +3434,12 @@
           <w14:ligatures w14:val="standardContextual"/>
         </w:rPr>
         <w:lastRenderedPageBreak/>
-        <w:t xml:space="preserve">CAMBIO: </w:t>
-      </w:r>
-      <w:r>
+        <w:t>CAMBIO: Tras analizar detenidamente este requisito, he comprobado que efectivamente había varios índices redundantes en las entidades, ya que muchos de ellos son generados automáticamente por el framework. Para corregir esta situación y mantener el esquema de base de datos limpio y eficiente, he procedido a eliminar todos los índices que hacían referencia exclusivamente a la id de la identidad, así como todos aquellos índices explícitos sobre columnas que ya estaban definidas como únicas, puesto que en estos casos el sistema ya crea automáticamente un índice único sin necesidad de declararlo manualmente.</w:t>
+      </w:r>
+    </w:p>
+    <w:p>
+      <w:pPr>
+        <w:pStyle w:val="Ttulo2"/>
         <w:rPr>
           <w:rFonts w:eastAsiaTheme="minorHAnsi" w:cstheme="majorHAnsi"/>
           <w:b w:val="0"/>
@@ -3542,86 +3447,13 @@
           <w:kern w:val="2"/>
           <w:sz w:val="24"/>
           <w:szCs w:val="24"/>
-          <w:highlight w:val="yellow"/>
-          <w:lang w:val="es-ES"/>
+          <w:lang w:val="en-US"/>
           <w14:ligatures w14:val="standardContextual"/>
         </w:rPr>
-        <w:t>Tras analizar detenidamente este requisito, he comprobado que efectivamente había varios índices redundantes en las entidades, ya que muchos de ellos son generados automáticamente por el framework</w:t>
-      </w:r>
-      <w:r>
-        <w:rPr>
-          <w:rFonts w:eastAsiaTheme="minorHAnsi" w:cstheme="majorHAnsi"/>
-          <w:b w:val="0"/>
-          <w:bCs w:val="0"/>
-          <w:kern w:val="2"/>
-          <w:sz w:val="24"/>
-          <w:szCs w:val="24"/>
-          <w:highlight w:val="yellow"/>
-          <w:lang w:val="es-ES"/>
-          <w14:ligatures w14:val="standardContextual"/>
-        </w:rPr>
-        <w:t xml:space="preserve">. </w:t>
-      </w:r>
-      <w:r>
-        <w:rPr>
-          <w:rFonts w:eastAsiaTheme="minorHAnsi" w:cstheme="majorHAnsi"/>
-          <w:b w:val="0"/>
-          <w:bCs w:val="0"/>
-          <w:kern w:val="2"/>
-          <w:sz w:val="24"/>
-          <w:szCs w:val="24"/>
-          <w:highlight w:val="yellow"/>
-          <w:lang w:val="es-ES"/>
-          <w14:ligatures w14:val="standardContextual"/>
-        </w:rPr>
-        <w:t>Para corregir esta situación y mantener el esquema de base de datos limpio y eficiente, he procedido a eliminar todos los índices que hacían referencia exclusivamente a la id de la identidad</w:t>
-      </w:r>
-      <w:r>
-        <w:rPr>
-          <w:rFonts w:eastAsiaTheme="minorHAnsi" w:cstheme="majorHAnsi"/>
-          <w:b w:val="0"/>
-          <w:bCs w:val="0"/>
-          <w:kern w:val="2"/>
-          <w:sz w:val="24"/>
-          <w:szCs w:val="24"/>
-          <w:highlight w:val="yellow"/>
-          <w:lang w:val="es-ES"/>
-          <w14:ligatures w14:val="standardContextual"/>
-        </w:rPr>
-        <w:t xml:space="preserve">, </w:t>
-      </w:r>
-      <w:r>
-        <w:rPr>
-          <w:rFonts w:eastAsiaTheme="minorHAnsi" w:cstheme="majorHAnsi"/>
-          <w:b w:val="0"/>
-          <w:bCs w:val="0"/>
-          <w:kern w:val="2"/>
-          <w:sz w:val="24"/>
-          <w:szCs w:val="24"/>
-          <w:highlight w:val="yellow"/>
-          <w:lang w:val="es-ES"/>
-          <w14:ligatures w14:val="standardContextual"/>
-        </w:rPr>
-        <w:t>así como todos aquellos índices explícitos sobre columnas que ya estaban definidas como únicas, puesto que en estos casos el sistema ya crea automáticamente un índice único sin necesidad de declararlo manualmente.</w:t>
-      </w:r>
-    </w:p>
-    <w:p>
-      <w:pPr>
-        <w:pStyle w:val="Ttulo2"/>
-        <w:rPr>
-          <w:rFonts w:eastAsiaTheme="minorHAnsi" w:cstheme="majorHAnsi"/>
-          <w:b w:val="0"/>
-          <w:bCs w:val="0"/>
-          <w:kern w:val="2"/>
-          <w:sz w:val="24"/>
-          <w:szCs w:val="24"/>
-          <w:lang w:val="es-ES"/>
-          <w14:ligatures w14:val="standardContextual"/>
-        </w:rPr>
-      </w:pPr>
-      <w:r>
-        <w:rPr>
-          <w:lang w:val="es-ES"/>
+      </w:pPr>
+      <w:r>
+        <w:rPr>
+          <w:lang w:val="en-US"/>
         </w:rPr>
         <w:t>Functional requirements</w:t>
       </w:r>
@@ -6888,6 +6720,7 @@
   <w:style w:type="character" w:default="1" w:styleId="Fuentedeprrafopredeter">
     <w:name w:val="Default Paragraph Font"/>
     <w:uiPriority w:val="1"/>
+    <w:semiHidden/>
     <w:unhideWhenUsed/>
   </w:style>
   <w:style w:type="table" w:default="1" w:styleId="Tablanormal">
@@ -8577,7 +8410,6 @@
     <w:sig w:usb0="E4002EFF" w:usb1="C200247B" w:usb2="00000009" w:usb3="00000000" w:csb0="000001FF" w:csb1="00000000"/>
   </w:font>
   <w:font w:name="Yu Gothic Light">
-    <w:altName w:val="游ゴシック Light"/>
     <w:panose1 w:val="020B0300000000000000"/>
     <w:charset w:val="80"/>
     <w:family w:val="swiss"/>
@@ -8646,6 +8478,7 @@
   <w:rsids>
     <w:rsidRoot w:val="004D7778"/>
     <w:rsid w:val="0001386A"/>
+    <w:rsid w:val="00020B45"/>
     <w:rsid w:val="00032363"/>
     <w:rsid w:val="00061CE8"/>
     <w:rsid w:val="000C49A8"/>
@@ -8666,9 +8499,11 @@
     <w:rsid w:val="004D7778"/>
     <w:rsid w:val="00532E78"/>
     <w:rsid w:val="005351FA"/>
+    <w:rsid w:val="005C1FFC"/>
     <w:rsid w:val="005F0BD3"/>
     <w:rsid w:val="00625AA3"/>
     <w:rsid w:val="00635F6F"/>
+    <w:rsid w:val="006479CE"/>
     <w:rsid w:val="006C3C3C"/>
     <w:rsid w:val="006C529B"/>
     <w:rsid w:val="00753204"/>

</xml_diff>